<commit_message>
Done by Opus 4.8
</commit_message>
<xml_diff>
--- a/docs/Fable-Computer-Community-Guidelines.docx
+++ b/docs/Fable-Computer-Community-Guidelines.docx
@@ -1098,7 +1098,7 @@
                 <w:i w:val="0"/>
                 <w:sz w:val="19"/>
               </w:rPr>
-              <w:t>doi.org/10.5281/zenodo.21369495</w:t>
+              <w:t>doi.org/10.5281/zenodo.21385646</w:t>
             </w:r>
           </w:p>
         </w:tc>
@@ -1344,7 +1344,7 @@
     </w:p>
     <w:p>
       <w:r>
-        <w:t>Document revision note (rev. 3, July 2026). Updated to reflect the Agent Lab’s record through 15 July 2026 (§7: twelve promoted notes, two review rejections converted into standards rules, four pre-registered predictions resolved and confirmed) and the manuscripts’ re-archiving under new version DOIs (Part I v5.5, Part II v1.5). §7 now also records that the daily posts run on scheduled Actions while the heavier pipelines are performed by Claude in maintainer-operated sessions, and states the agent vote’s scope as GOVERNANCE.md defines it. The canonical versions of all rules remain the repository files.</w:t>
+        <w:t>Document revision note (rev. 3, July 2026). Updated to reflect the Agent Lab’s record through 15 July 2026 (§7: twelve promoted notes, two review rejections converted into standards rules, four pre-registered predictions resolved and confirmed) and the manuscripts’ re-archiving under new version DOIs (Part I v5.5, Part II v1.6). §7 now also records that the daily posts run on scheduled Actions while the heavier pipelines are performed by Claude in maintainer-operated sessions, and states the agent vote’s scope as GOVERNANCE.md defines it. The canonical versions of all rules remain the repository files.</w:t>
       </w:r>
     </w:p>
     <w:sectPr>

</xml_diff>

<commit_message>
Updates by opus 4.8
</commit_message>
<xml_diff>
--- a/docs/Fable-Computer-Community-Guidelines.docx
+++ b/docs/Fable-Computer-Community-Guidelines.docx
@@ -1051,7 +1051,7 @@
                 <w:i w:val="0"/>
                 <w:sz w:val="19"/>
               </w:rPr>
-              <w:t>Part I manuscript (DOI)</w:t>
+              <w:t>Part I manuscript (PDF)</w:t>
             </w:r>
           </w:p>
         </w:tc>
@@ -1066,7 +1066,7 @@
                 <w:i w:val="0"/>
                 <w:sz w:val="19"/>
               </w:rPr>
-              <w:t>doi.org/10.5281/zenodo.21369405</w:t>
+              <w:t>https://github.com/ryoji-info/FableComputer/blob/main/papers/Fable-Computer-Part-I.pdf</w:t>
             </w:r>
           </w:p>
         </w:tc>
@@ -1083,7 +1083,7 @@
                 <w:i w:val="0"/>
                 <w:sz w:val="19"/>
               </w:rPr>
-              <w:t>Part II manuscript (DOI)</w:t>
+              <w:t>Part II manuscript (PDF)</w:t>
             </w:r>
           </w:p>
         </w:tc>
@@ -1098,7 +1098,7 @@
                 <w:i w:val="0"/>
                 <w:sz w:val="19"/>
               </w:rPr>
-              <w:t>doi.org/10.5281/zenodo.21385646</w:t>
+              <w:t>https://github.com/ryoji-info/FableComputer/blob/main/papers/Fable-Computer-Part-II.pdf</w:t>
             </w:r>
           </w:p>
         </w:tc>

</xml_diff>

<commit_message>
Record audit F8/F9: correct the persona files and the public on-ramp documents
per notes/2026-07-26-record-audit-ten-findings.md

Co-Authored-By: Claude Opus 5 <noreply@anthropic.com>
</commit_message>
<xml_diff>
--- a/docs/Fable-Computer-Community-Guidelines.docx
+++ b/docs/Fable-Computer-Community-Guidelines.docx
@@ -1347,6 +1347,11 @@
         <w:t>Document revision note (rev. 3, July 2026). Updated to reflect the Agent Lab’s record through 15 July 2026 (§7: twelve promoted notes, two review rejections converted into standards rules, four pre-registered predictions resolved and confirmed) and the manuscripts’ re-archiving under new version DOIs (Part I v5.5, Part II v1.6). §7 now also records that the daily posts run on scheduled Actions while the heavier pipelines are performed by Claude in maintainer-operated sessions, and states the agent vote’s scope as GOVERNANCE.md defines it. The canonical versions of all rules remain the repository files.</w:t>
       </w:r>
     </w:p>
+    <w:p>
+      <w:r>
+        <w:t>Document revision note (rev. 4, July 2026). The version references in the rev. 3 note above (Part I v5.5, Part II v1.6) record the deposits as they stood; the manuscripts now shipped in papers/ are Part I v5.6 and Part II v1.7, and corrections the deposited PDFs do not yet carry are listed in papers/ERRATA.md. §7's description of the pipelines is also superseded: since 2026-07-16 every pipeline, including the daily posts, is performed by Claude in maintainer-operated sessions, with the API-key workflows retained as manually dispatchable fallbacks (see agents/README.md, “Operations”). Per notes/2026-07-26-record-audit-ten-findings.md. The rev. 3 note above is left as written.</w:t>
+      </w:r>
+    </w:p>
     <w:sectPr>
       <w:footerReference w:type="default" r:id="rId9"/>
       <w:pgSz w:w="11906" w:h="16838"/>

</xml_diff>

<commit_message>
Papers v6.0 / v2.0: the reader-focused revision — revision notes out, record folded in, versions external
per notes/2026-07-26-record-audit-ten-findings.md

Co-Authored-By: Claude Opus 5 <noreply@anthropic.com>
</commit_message>
<xml_diff>
--- a/docs/Fable-Computer-Community-Guidelines.docx
+++ b/docs/Fable-Computer-Community-Guidelines.docx
@@ -29,7 +29,7 @@
           <w:color w:val="4B5B68"/>
           <w:sz w:val="18"/>
         </w:rPr>
-        <w:t>July 2026 (rev. 3)  ·  github.com/ryoji-info/FableComputer  ·  This document is an orientation guide; the canonical, versioned rules are the files in the repository (GOVERNANCE.md, CONTRIBUTING.md, CHARTER.md, AUTHORSHIP.md, CODE_OF_CONDUCT.md). If this summary and those files ever disagree, the repository files govern.</w:t>
+        <w:t>July 2026 (rev. 5)  ·  github.com/ryoji-info/FableComputer  ·  This document is an orientation guide; the canonical, versioned rules are the files in the repository (GOVERNANCE.md, CONTRIBUTING.md, CHARTER.md, AUTHORSHIP.md, CODE_OF_CONDUCT.md). If this summary and those files ever disagree, the repository files govern.</w:t>
       </w:r>
     </w:p>
     <w:p>
@@ -1352,6 +1352,11 @@
         <w:t>Document revision note (rev. 4, July 2026). The version references in the rev. 3 note above (Part I v5.5, Part II v1.6) record the deposits as they stood; the manuscripts now shipped in papers/ are Part I v5.6 and Part II v1.7, and corrections the deposited PDFs do not yet carry are listed in papers/ERRATA.md. §7's description of the pipelines is also superseded: since 2026-07-16 every pipeline, including the daily posts, is performed by Claude in maintainer-operated sessions, with the API-key workflows retained as manually dispatchable fallbacks (see agents/README.md, “Operations”). Per notes/2026-07-26-record-audit-ten-findings.md. The rev. 3 note above is left as written.</w:t>
       </w:r>
     </w:p>
+    <w:p>
+      <w:r>
+        <w:t>Document revision note (rev. 5, July 2026). The manuscripts are now Part I v6.0 and Part II v2.0; in-document version statements were removed and the complete revision history lives in papers/REVISION-HISTORY.md. The notes above are left as written.</w:t>
+      </w:r>
+    </w:p>
     <w:sectPr>
       <w:footerReference w:type="default" r:id="rId9"/>
       <w:pgSz w:w="11906" w:h="16838"/>

</xml_diff>

<commit_message>
Record audit, final items: emit the physical threshold and the decoder conventions, plus the reference operating point, pre-registered keys, and positioning page
per notes/2026-07-26-record-audit-ten-findings.md

Co-Authored-By: Claude Opus 5 <noreply@anthropic.com>
</commit_message>
<xml_diff>
--- a/docs/Fable-Computer-Community-Guidelines.docx
+++ b/docs/Fable-Computer-Community-Guidelines.docx
@@ -29,7 +29,7 @@
           <w:color w:val="4B5B68"/>
           <w:sz w:val="18"/>
         </w:rPr>
-        <w:t>July 2026 (rev. 3)  ·  github.com/ryoji-info/FableComputer  ·  This document is an orientation guide; the canonical, versioned rules are the files in the repository (GOVERNANCE.md, CONTRIBUTING.md, CHARTER.md, AUTHORSHIP.md, CODE_OF_CONDUCT.md). If this summary and those files ever disagree, the repository files govern.</w:t>
+        <w:t>July 2026 (rev. 5)  ·  github.com/ryoji-info/FableComputer  ·  This document is an orientation guide; the canonical, versioned rules are the files in the repository (GOVERNANCE.md, CONTRIBUTING.md, CHARTER.md, AUTHORSHIP.md, CODE_OF_CONDUCT.md). If this summary and those files ever disagree, the repository files govern.</w:t>
       </w:r>
     </w:p>
     <w:p>
@@ -1352,6 +1352,11 @@
         <w:t>Document revision note (rev. 4, July 2026). The version references in the rev. 3 note above (Part I v5.5, Part II v1.6) record the deposits as they stood; the manuscripts now shipped in papers/ are Part I v5.6 and Part II v1.7, and corrections the deposited PDFs do not yet carry are listed in papers/ERRATA.md. §7's description of the pipelines is also superseded: since 2026-07-16 every pipeline, including the daily posts, is performed by Claude in maintainer-operated sessions, with the API-key workflows retained as manually dispatchable fallbacks (see agents/README.md, “Operations”). Per notes/2026-07-26-record-audit-ten-findings.md. The rev. 3 note above is left as written.</w:t>
       </w:r>
     </w:p>
+    <w:p>
+      <w:r>
+        <w:t>Document revision note (rev. 5, July 2026). The manuscripts are now Part I v6.0 and Part II v2.0; in-document version statements were removed and the complete revision history lives in papers/REVISION-HISTORY.md. The notes above are left as written.</w:t>
+      </w:r>
+    </w:p>
     <w:sectPr>
       <w:footerReference w:type="default" r:id="rId9"/>
       <w:pgSz w:w="11906" w:h="16838"/>

</xml_diff>